<commit_message>
Updates template to use dynamic placeholders and corrects signatory
Replaces hardcoded text with dynamic placeholders for recipient details,
data fields, and data rows to improve template flexibility. Removes
sample data, adapts for multiple regions, and updates signatory from
Max Darmawan to Eddy Wahyudi for accuracy and maintainability.
</commit_message>
<xml_diff>
--- a/diamond_web/fixtures/default_templates/surat_pkdi_regional_sebagian.docx
+++ b/diamond_web/fixtures/default_templates/surat_pkdi_regional_sebagian.docx
@@ -112,14 +112,24 @@
                 <w:rFonts w:eastAsia="Arial"/>
               </w:rPr>
             </w:pPr>
-            <w:hyperlink r:id="rId9" w:history="1">
-              <w:r>
-                <w:rPr>
-                  <w:rFonts w:eastAsia="Arial"/>
-                </w:rPr>
-                <w:t>[@NomorND]</w:t>
-              </w:r>
-            </w:hyperlink>
+            <w:r>
+              <w:fldChar w:fldCharType="begin"/>
+            </w:r>
+            <w:r>
+              <w:instrText>HYPERLINK "file:///C:/Users/921002181/Downloads/%5b@NomorND%5d"</w:instrText>
+            </w:r>
+            <w:r>
+              <w:fldChar w:fldCharType="separate"/>
+            </w:r>
+            <w:r>
+              <w:rPr>
+                <w:rFonts w:eastAsia="Arial"/>
+              </w:rPr>
+              <w:t>[@NomorND]</w:t>
+            </w:r>
+            <w:r>
+              <w:fldChar w:fldCharType="end"/>
+            </w:r>
           </w:p>
         </w:tc>
         <w:tc>
@@ -146,7 +156,7 @@
                 <w:rFonts w:eastAsia="Arial"/>
               </w:rPr>
             </w:pPr>
-            <w:hyperlink r:id="rId10" w:history="1">
+            <w:hyperlink r:id="rId9" w:history="1">
               <w:r>
                 <w:rPr>
                   <w:rFonts w:eastAsia="Arial"/>
@@ -247,6 +257,7 @@
                 <w:lang w:val="en-US"/>
               </w:rPr>
             </w:pPr>
+            <w:proofErr w:type="spellStart"/>
             <w:r>
               <w:rPr>
                 <w:rFonts w:eastAsia="Arial"/>
@@ -255,6 +266,7 @@
               </w:rPr>
               <w:t>Biasa</w:t>
             </w:r>
+            <w:proofErr w:type="spellEnd"/>
           </w:p>
         </w:tc>
       </w:tr>
@@ -347,15 +359,25 @@
                 <w:highlight w:val="yellow"/>
               </w:rPr>
             </w:pPr>
-            <w:hyperlink r:id="rId11" w:history="1">
-              <w:r>
-                <w:rPr>
-                  <w:rFonts w:eastAsia="Arial"/>
-                  <w:highlight w:val="yellow"/>
-                </w:rPr>
-                <w:t>1 (satu) Lembar</w:t>
-              </w:r>
-            </w:hyperlink>
+            <w:r>
+              <w:fldChar w:fldCharType="begin"/>
+            </w:r>
+            <w:r>
+              <w:instrText>HYPERLINK "file:///C:/Users/921002181/Downloads/%5b@Lampiran%5d"</w:instrText>
+            </w:r>
+            <w:r>
+              <w:fldChar w:fldCharType="separate"/>
+            </w:r>
+            <w:r>
+              <w:rPr>
+                <w:rFonts w:eastAsia="Arial"/>
+                <w:highlight w:val="yellow"/>
+              </w:rPr>
+              <w:t>1 (satu) Lembar</w:t>
+            </w:r>
+            <w:r>
+              <w:fldChar w:fldCharType="end"/>
+            </w:r>
           </w:p>
         </w:tc>
       </w:tr>
@@ -473,12 +495,21 @@
               </w:rPr>
               <w:t xml:space="preserve"> </w:t>
             </w:r>
+            <w:proofErr w:type="spellStart"/>
             <w:r>
               <w:rPr>
                 <w:rFonts w:eastAsia="Arial"/>
                 <w:lang w:val="en-US"/>
               </w:rPr>
-              <w:t xml:space="preserve">Tahun Data </w:t>
+              <w:t>Tahun</w:t>
+            </w:r>
+            <w:proofErr w:type="spellEnd"/>
+            <w:r>
+              <w:rPr>
+                <w:rFonts w:eastAsia="Arial"/>
+                <w:lang w:val="en-US"/>
+              </w:rPr>
+              <w:t xml:space="preserve"> Data </w:t>
             </w:r>
             <w:r>
               <w:rPr>
@@ -486,15 +517,56 @@
                 <w:highlight w:val="yellow"/>
                 <w:lang w:val="en-US"/>
               </w:rPr>
-              <w:t xml:space="preserve">2024 </w:t>
-            </w:r>
+              <w:t>{{</w:t>
+            </w:r>
+            <w:proofErr w:type="spellStart"/>
             <w:r>
               <w:rPr>
                 <w:rFonts w:eastAsia="Arial"/>
                 <w:highlight w:val="yellow"/>
                 <w:lang w:val="en-US"/>
               </w:rPr>
-              <w:t>Kabupaten Pemalang</w:t>
+              <w:t>tahun_data</w:t>
+            </w:r>
+            <w:proofErr w:type="spellEnd"/>
+            <w:r>
+              <w:rPr>
+                <w:rFonts w:eastAsia="Arial"/>
+                <w:highlight w:val="yellow"/>
+                <w:lang w:val="en-US"/>
+              </w:rPr>
+              <w:t>}}</w:t>
+            </w:r>
+            <w:r>
+              <w:rPr>
+                <w:rFonts w:eastAsia="Arial"/>
+                <w:highlight w:val="yellow"/>
+                <w:lang w:val="en-US"/>
+              </w:rPr>
+              <w:t xml:space="preserve"> </w:t>
+            </w:r>
+            <w:r>
+              <w:rPr>
+                <w:rFonts w:eastAsia="Arial"/>
+                <w:lang w:val="en-US"/>
+              </w:rPr>
+              <w:t>{{</w:t>
+            </w:r>
+            <w:proofErr w:type="spellStart"/>
+            <w:r>
+              <w:rPr>
+                <w:rFonts w:eastAsia="Arial"/>
+                <w:lang w:val="en-US"/>
+              </w:rPr>
+              <w:t>nama_ilap</w:t>
+            </w:r>
+            <w:proofErr w:type="spellEnd"/>
+            <w:r>
+              <w:rPr>
+                <w:rFonts w:eastAsia="Arial"/>
+                <w:lang w:val="en-US"/>
+              </w:rPr>
+              <w:t>}}</w:t>
             </w:r>
           </w:p>
         </w:tc>
@@ -522,22 +594,27 @@
         <w:rPr>
           <w:highlight w:val="yellow"/>
         </w:rPr>
-        <w:t xml:space="preserve">Yth. Kepala Badan Pengelolaan Pendapatan Daerah Kabupaten Pemalang </w:t>
-      </w:r>
-    </w:p>
-    <w:p>
-      <w:pPr>
-        <w:ind w:left="-170" w:right="57"/>
-        <w:jc w:val="both"/>
+        <w:t xml:space="preserve">Yth. Kepala Badan Pengelolaan Pendapatan Daerah </w:t>
+      </w:r>
+      <w:r>
         <w:rPr>
           <w:highlight w:val="yellow"/>
         </w:rPr>
-      </w:pPr>
+        <w:t>{{</w:t>
+      </w:r>
+      <w:proofErr w:type="spellStart"/>
       <w:r>
         <w:rPr>
           <w:highlight w:val="yellow"/>
         </w:rPr>
-        <w:t>Jl. Suro Hadikusumo No.1, Kebondalem, Kec. Pemalang</w:t>
+        <w:t>nama_ilap</w:t>
+      </w:r>
+      <w:proofErr w:type="spellEnd"/>
+      <w:r>
+        <w:rPr>
+          <w:highlight w:val="yellow"/>
+        </w:rPr>
+        <w:t>}}</w:t>
       </w:r>
     </w:p>
     <w:p>
@@ -549,20 +626,7 @@
         <w:rPr>
           <w:highlight w:val="yellow"/>
         </w:rPr>
-        <w:t>Kabupaten Pemalang</w:t>
-      </w:r>
-      <w:r>
-        <w:rPr>
-          <w:highlight w:val="yellow"/>
-          <w:lang w:val="en-US"/>
-        </w:rPr>
-        <w:t xml:space="preserve">, Provinsi </w:t>
-      </w:r>
-      <w:r>
-        <w:rPr>
-          <w:highlight w:val="yellow"/>
-        </w:rPr>
-        <w:t>Jawa Tengah</w:t>
+        <w:t>alamat</w:t>
       </w:r>
     </w:p>
     <w:p>
@@ -591,21 +655,95 @@
       <w:r>
         <w:t xml:space="preserve">Dengan ini diberitahukan bahwa Data dan Informasi yang </w:t>
       </w:r>
+      <w:proofErr w:type="spellStart"/>
       <w:r>
         <w:rPr>
           <w:lang w:val="en-US"/>
         </w:rPr>
         <w:t>Saudara</w:t>
       </w:r>
+      <w:proofErr w:type="spellEnd"/>
       <w:r>
         <w:t xml:space="preserve"> sampaikan </w:t>
       </w:r>
-      <w:r>
-        <w:rPr>
-          <w:lang w:val="en-US"/>
-        </w:rPr>
-        <w:t>telah kami terima dengan infomasi sebagai berikut</w:t>
-      </w:r>
+      <w:proofErr w:type="spellStart"/>
+      <w:r>
+        <w:rPr>
+          <w:lang w:val="en-US"/>
+        </w:rPr>
+        <w:t>telah</w:t>
+      </w:r>
+      <w:proofErr w:type="spellEnd"/>
+      <w:r>
+        <w:rPr>
+          <w:lang w:val="en-US"/>
+        </w:rPr>
+        <w:t xml:space="preserve"> kami </w:t>
+      </w:r>
+      <w:proofErr w:type="spellStart"/>
+      <w:r>
+        <w:rPr>
+          <w:lang w:val="en-US"/>
+        </w:rPr>
+        <w:t>terima</w:t>
+      </w:r>
+      <w:proofErr w:type="spellEnd"/>
+      <w:r>
+        <w:rPr>
+          <w:lang w:val="en-US"/>
+        </w:rPr>
+        <w:t xml:space="preserve"> </w:t>
+      </w:r>
+      <w:proofErr w:type="spellStart"/>
+      <w:r>
+        <w:rPr>
+          <w:lang w:val="en-US"/>
+        </w:rPr>
+        <w:t>dengan</w:t>
+      </w:r>
+      <w:proofErr w:type="spellEnd"/>
+      <w:r>
+        <w:rPr>
+          <w:lang w:val="en-US"/>
+        </w:rPr>
+        <w:t xml:space="preserve"> </w:t>
+      </w:r>
+      <w:proofErr w:type="spellStart"/>
+      <w:r>
+        <w:rPr>
+          <w:lang w:val="en-US"/>
+        </w:rPr>
+        <w:t>infomasi</w:t>
+      </w:r>
+      <w:proofErr w:type="spellEnd"/>
+      <w:r>
+        <w:rPr>
+          <w:lang w:val="en-US"/>
+        </w:rPr>
+        <w:t xml:space="preserve"> </w:t>
+      </w:r>
+      <w:proofErr w:type="spellStart"/>
+      <w:r>
+        <w:rPr>
+          <w:lang w:val="en-US"/>
+        </w:rPr>
+        <w:t>sebagai</w:t>
+      </w:r>
+      <w:proofErr w:type="spellEnd"/>
+      <w:r>
+        <w:rPr>
+          <w:lang w:val="en-US"/>
+        </w:rPr>
+        <w:t xml:space="preserve"> </w:t>
+      </w:r>
+      <w:proofErr w:type="spellStart"/>
+      <w:r>
+        <w:rPr>
+          <w:lang w:val="en-US"/>
+        </w:rPr>
+        <w:t>berikut</w:t>
+      </w:r>
+      <w:proofErr w:type="spellEnd"/>
       <w:r>
         <w:t>:</w:t>
       </w:r>
@@ -692,24 +830,20 @@
             </w:pPr>
             <w:r>
               <w:rPr>
-                <w:highlight w:val="yellow"/>
-                <w:lang w:val="en-US"/>
-              </w:rPr>
-              <w:t xml:space="preserve">(Silahkan </w:t>
-            </w:r>
-            <w:r>
-              <w:rPr>
-                <w:highlight w:val="yellow"/>
-                <w:lang w:val="en-US"/>
-              </w:rPr>
-              <w:t>ditulis</w:t>
-            </w:r>
-            <w:r>
-              <w:rPr>
-                <w:highlight w:val="yellow"/>
-                <w:lang w:val="en-US"/>
-              </w:rPr>
-              <w:t xml:space="preserve"> “Terlampir” jika terdapat beberapa surat dari satu Pemda)</w:t>
+                <w:lang w:val="en-US"/>
+              </w:rPr>
+              <w:t>{{</w:t>
+            </w:r>
+            <w:proofErr w:type="spellStart"/>
+            <w:r>
+              <w:t>nomor_surat_pengantar</w:t>
+            </w:r>
+            <w:proofErr w:type="spellEnd"/>
+            <w:r>
+              <w:rPr>
+                <w:lang w:val="en-US"/>
+              </w:rPr>
+              <w:t>}}</w:t>
             </w:r>
           </w:p>
         </w:tc>
@@ -775,24 +909,20 @@
             </w:pPr>
             <w:r>
               <w:rPr>
-                <w:highlight w:val="yellow"/>
-                <w:lang w:val="en-US"/>
-              </w:rPr>
-              <w:t>(Silahkan di</w:t>
-            </w:r>
-            <w:r>
-              <w:rPr>
-                <w:highlight w:val="yellow"/>
-                <w:lang w:val="en-US"/>
-              </w:rPr>
-              <w:t>tulis</w:t>
-            </w:r>
-            <w:r>
-              <w:rPr>
-                <w:highlight w:val="yellow"/>
-                <w:lang w:val="en-US"/>
-              </w:rPr>
-              <w:t xml:space="preserve"> “Terlampir” jika terdapat beberapa surat dari satu Pemda)</w:t>
+                <w:lang w:val="en-US"/>
+              </w:rPr>
+              <w:t>{{</w:t>
+            </w:r>
+            <w:proofErr w:type="spellStart"/>
+            <w:r>
+              <w:t>tanggal_surat_pengantar</w:t>
+            </w:r>
+            <w:proofErr w:type="spellEnd"/>
+            <w:r>
+              <w:rPr>
+                <w:lang w:val="en-US"/>
+              </w:rPr>
+              <w:t>}}</w:t>
             </w:r>
           </w:p>
         </w:tc>
@@ -863,19 +993,22 @@
                 <w:noProof/>
                 <w:lang w:val="en-US"/>
               </w:rPr>
-              <w:t xml:space="preserve">Tahun </w:t>
-            </w:r>
-            <w:r>
-              <w:rPr>
-                <w:lang w:val="en-US"/>
-              </w:rPr>
-              <w:t>…</w:t>
-            </w:r>
-            <w:r>
-              <w:rPr>
-                <w:lang w:val="en-US"/>
-              </w:rPr>
-              <w:t>….</w:t>
+              <w:t>Tahun {{</w:t>
+            </w:r>
+            <w:r>
+              <w:rPr>
+                <w:rFonts w:eastAsia="Arial" w:cs="Arial"/>
+                <w:noProof/>
+              </w:rPr>
+              <w:t>tahun_data</w:t>
+            </w:r>
+            <w:r>
+              <w:rPr>
+                <w:rFonts w:eastAsia="Arial" w:cs="Arial"/>
+                <w:noProof/>
+                <w:lang w:val="en-US"/>
+              </w:rPr>
+              <w:t>}}</w:t>
             </w:r>
           </w:p>
         </w:tc>
@@ -943,7 +1076,20 @@
               <w:rPr>
                 <w:lang w:val="en-US"/>
               </w:rPr>
-              <w:t>……………..</w:t>
+              <w:t>{{</w:t>
+            </w:r>
+            <w:r>
+              <w:rPr>
+                <w:rFonts w:eastAsia="Arial" w:cs="Arial"/>
+                <w:noProof/>
+              </w:rPr>
+              <w:t>tanggal_terima_dip</w:t>
+            </w:r>
+            <w:r>
+              <w:rPr>
+                <w:lang w:val="en-US"/>
+              </w:rPr>
+              <w:t>}}</w:t>
             </w:r>
           </w:p>
         </w:tc>
@@ -1008,7 +1154,15 @@
               </w:rPr>
             </w:pPr>
             <w:r>
-              <w:t xml:space="preserve">Langsung </w:t>
+              <w:t>{{</w:t>
+            </w:r>
+            <w:proofErr w:type="spellStart"/>
+            <w:r>
+              <w:t>cara_penyampaian</w:t>
+            </w:r>
+            <w:proofErr w:type="spellEnd"/>
+            <w:r>
+              <w:t>}}</w:t>
             </w:r>
           </w:p>
         </w:tc>
@@ -1073,9 +1227,11 @@
                 <w:lang w:val="en-US"/>
               </w:rPr>
             </w:pPr>
+            <w:proofErr w:type="spellStart"/>
             <w:r>
               <w:t>Terlampi</w:t>
             </w:r>
+            <w:proofErr w:type="spellEnd"/>
             <w:r>
               <w:rPr>
                 <w:lang w:val="en-US"/>
@@ -1108,8 +1264,16 @@
               <w:rPr>
                 <w:lang w:val="en-US"/>
               </w:rPr>
-              <w:t xml:space="preserve"> Diterima</w:t>
-            </w:r>
+              <w:t xml:space="preserve"> </w:t>
+            </w:r>
+            <w:proofErr w:type="spellStart"/>
+            <w:r>
+              <w:rPr>
+                <w:lang w:val="en-US"/>
+              </w:rPr>
+              <w:t>Diterima</w:t>
+            </w:r>
+            <w:proofErr w:type="spellEnd"/>
           </w:p>
         </w:tc>
         <w:tc>
@@ -1151,9 +1315,11 @@
                 <w:noProof/>
               </w:rPr>
             </w:pPr>
+            <w:proofErr w:type="spellStart"/>
             <w:r>
               <w:t>Terlampi</w:t>
             </w:r>
+            <w:proofErr w:type="spellEnd"/>
             <w:r>
               <w:rPr>
                 <w:lang w:val="en-US"/>
@@ -1257,9 +1423,11 @@
                 <w:lang w:val="en-US"/>
               </w:rPr>
             </w:pPr>
+            <w:proofErr w:type="spellStart"/>
             <w:r>
               <w:t>Terlampi</w:t>
             </w:r>
+            <w:proofErr w:type="spellEnd"/>
             <w:r>
               <w:rPr>
                 <w:lang w:val="en-US"/>
@@ -1277,11 +1445,19 @@
                 <w:noProof/>
               </w:rPr>
             </w:pPr>
-            <w:r>
-              <w:rPr>
-                <w:lang w:val="en-US"/>
-              </w:rPr>
-              <w:t>Terlampir.</w:t>
+            <w:proofErr w:type="spellStart"/>
+            <w:r>
+              <w:rPr>
+                <w:lang w:val="en-US"/>
+              </w:rPr>
+              <w:t>Terlampir</w:t>
+            </w:r>
+            <w:proofErr w:type="spellEnd"/>
+            <w:r>
+              <w:rPr>
+                <w:lang w:val="en-US"/>
+              </w:rPr>
+              <w:t>.</w:t>
             </w:r>
           </w:p>
         </w:tc>
@@ -1306,31 +1482,153 @@
         <w:rPr>
           <w:lang w:val="en-US"/>
         </w:rPr>
-        <w:t>tas data yang terdapat</w:t>
-      </w:r>
-      <w:r>
-        <w:rPr>
-          <w:lang w:val="en-US"/>
-        </w:rPr>
-        <w:t xml:space="preserve"> jumlah baris data</w:t>
-      </w:r>
-      <w:r>
-        <w:rPr>
-          <w:lang w:val="en-US"/>
-        </w:rPr>
-        <w:t xml:space="preserve"> tidak lengkap</w:t>
-      </w:r>
-      <w:r>
-        <w:rPr>
-          <w:lang w:val="en-US"/>
-        </w:rPr>
-        <w:t xml:space="preserve"> sebagaimana terlampir </w:t>
-      </w:r>
-      <w:r>
-        <w:rPr>
-          <w:lang w:val="en-US"/>
-        </w:rPr>
-        <w:t xml:space="preserve">dilakukan klarifikasi melalui surat </w:t>
+        <w:t xml:space="preserve">tas data yang </w:t>
+      </w:r>
+      <w:proofErr w:type="spellStart"/>
+      <w:r>
+        <w:rPr>
+          <w:lang w:val="en-US"/>
+        </w:rPr>
+        <w:t>terdapat</w:t>
+      </w:r>
+      <w:proofErr w:type="spellEnd"/>
+      <w:r>
+        <w:rPr>
+          <w:lang w:val="en-US"/>
+        </w:rPr>
+        <w:t xml:space="preserve"> </w:t>
+      </w:r>
+      <w:proofErr w:type="spellStart"/>
+      <w:r>
+        <w:rPr>
+          <w:lang w:val="en-US"/>
+        </w:rPr>
+        <w:t>jumlah</w:t>
+      </w:r>
+      <w:proofErr w:type="spellEnd"/>
+      <w:r>
+        <w:rPr>
+          <w:lang w:val="en-US"/>
+        </w:rPr>
+        <w:t xml:space="preserve"> baris data</w:t>
+      </w:r>
+      <w:r>
+        <w:rPr>
+          <w:lang w:val="en-US"/>
+        </w:rPr>
+        <w:t xml:space="preserve"> </w:t>
+      </w:r>
+      <w:proofErr w:type="spellStart"/>
+      <w:r>
+        <w:rPr>
+          <w:lang w:val="en-US"/>
+        </w:rPr>
+        <w:t>tidak</w:t>
+      </w:r>
+      <w:proofErr w:type="spellEnd"/>
+      <w:r>
+        <w:rPr>
+          <w:lang w:val="en-US"/>
+        </w:rPr>
+        <w:t xml:space="preserve"> </w:t>
+      </w:r>
+      <w:proofErr w:type="spellStart"/>
+      <w:r>
+        <w:rPr>
+          <w:lang w:val="en-US"/>
+        </w:rPr>
+        <w:t>lengkap</w:t>
+      </w:r>
+      <w:proofErr w:type="spellEnd"/>
+      <w:r>
+        <w:rPr>
+          <w:lang w:val="en-US"/>
+        </w:rPr>
+        <w:t xml:space="preserve"> </w:t>
+      </w:r>
+      <w:proofErr w:type="spellStart"/>
+      <w:r>
+        <w:rPr>
+          <w:lang w:val="en-US"/>
+        </w:rPr>
+        <w:t>sebagaimana</w:t>
+      </w:r>
+      <w:proofErr w:type="spellEnd"/>
+      <w:r>
+        <w:rPr>
+          <w:lang w:val="en-US"/>
+        </w:rPr>
+        <w:t xml:space="preserve"> </w:t>
+      </w:r>
+      <w:proofErr w:type="spellStart"/>
+      <w:r>
+        <w:rPr>
+          <w:lang w:val="en-US"/>
+        </w:rPr>
+        <w:t>terlampir</w:t>
+      </w:r>
+      <w:proofErr w:type="spellEnd"/>
+      <w:r>
+        <w:rPr>
+          <w:lang w:val="en-US"/>
+        </w:rPr>
+        <w:t xml:space="preserve"> </w:t>
+      </w:r>
+      <w:proofErr w:type="spellStart"/>
+      <w:r>
+        <w:rPr>
+          <w:lang w:val="en-US"/>
+        </w:rPr>
+        <w:t>dilakukan</w:t>
+      </w:r>
+      <w:proofErr w:type="spellEnd"/>
+      <w:r>
+        <w:rPr>
+          <w:lang w:val="en-US"/>
+        </w:rPr>
+        <w:t xml:space="preserve"> </w:t>
+      </w:r>
+      <w:proofErr w:type="spellStart"/>
+      <w:r>
+        <w:rPr>
+          <w:lang w:val="en-US"/>
+        </w:rPr>
+        <w:t>klarifikasi</w:t>
+      </w:r>
+      <w:proofErr w:type="spellEnd"/>
+      <w:r>
+        <w:rPr>
+          <w:lang w:val="en-US"/>
+        </w:rPr>
+        <w:t xml:space="preserve"> </w:t>
+      </w:r>
+      <w:proofErr w:type="spellStart"/>
+      <w:r>
+        <w:rPr>
+          <w:lang w:val="en-US"/>
+        </w:rPr>
+        <w:t>melalui</w:t>
+      </w:r>
+      <w:proofErr w:type="spellEnd"/>
+      <w:r>
+        <w:rPr>
+          <w:lang w:val="en-US"/>
+        </w:rPr>
+        <w:t xml:space="preserve"> </w:t>
+      </w:r>
+      <w:proofErr w:type="spellStart"/>
+      <w:r>
+        <w:rPr>
+          <w:lang w:val="en-US"/>
+        </w:rPr>
+        <w:t>surat</w:t>
+      </w:r>
+      <w:proofErr w:type="spellEnd"/>
+      <w:r>
+        <w:rPr>
+          <w:lang w:val="en-US"/>
+        </w:rPr>
+        <w:t xml:space="preserve"> </w:t>
       </w:r>
       <w:r>
         <w:rPr>
@@ -1343,8 +1641,33 @@
           <w:rFonts w:eastAsia="Arial"/>
           <w:lang w:val="en-US"/>
         </w:rPr>
-        <w:t>Data dan/atau Informasi</w:t>
-      </w:r>
+        <w:t>Data dan/</w:t>
+      </w:r>
+      <w:proofErr w:type="spellStart"/>
+      <w:r>
+        <w:rPr>
+          <w:rFonts w:eastAsia="Arial"/>
+          <w:lang w:val="en-US"/>
+        </w:rPr>
+        <w:t>atau</w:t>
+      </w:r>
+      <w:proofErr w:type="spellEnd"/>
+      <w:r>
+        <w:rPr>
+          <w:rFonts w:eastAsia="Arial"/>
+          <w:lang w:val="en-US"/>
+        </w:rPr>
+        <w:t xml:space="preserve"> </w:t>
+      </w:r>
+      <w:proofErr w:type="spellStart"/>
+      <w:r>
+        <w:rPr>
+          <w:rFonts w:eastAsia="Arial"/>
+          <w:lang w:val="en-US"/>
+        </w:rPr>
+        <w:t>Informasi</w:t>
+      </w:r>
+      <w:proofErr w:type="spellEnd"/>
       <w:r>
         <w:rPr>
           <w:lang w:val="en-US"/>
@@ -1365,31 +1688,189 @@
         <w:rPr>
           <w:lang w:val="en-US"/>
         </w:rPr>
-        <w:t xml:space="preserve">Surat Pemberitahuan Kelengkapan Data dan Informasi ini tidak </w:t>
-      </w:r>
-      <w:r>
-        <w:rPr>
-          <w:lang w:val="en-US"/>
-        </w:rPr>
-        <w:t xml:space="preserve">sepenuhnya </w:t>
-      </w:r>
+        <w:t xml:space="preserve">Surat </w:t>
+      </w:r>
+      <w:proofErr w:type="spellStart"/>
+      <w:r>
+        <w:rPr>
+          <w:lang w:val="en-US"/>
+        </w:rPr>
+        <w:t>Pemberitahuan</w:t>
+      </w:r>
+      <w:proofErr w:type="spellEnd"/>
+      <w:r>
+        <w:rPr>
+          <w:lang w:val="en-US"/>
+        </w:rPr>
+        <w:t xml:space="preserve"> </w:t>
+      </w:r>
+      <w:proofErr w:type="spellStart"/>
+      <w:r>
+        <w:rPr>
+          <w:lang w:val="en-US"/>
+        </w:rPr>
+        <w:t>Kelengkapan</w:t>
+      </w:r>
+      <w:proofErr w:type="spellEnd"/>
+      <w:r>
+        <w:rPr>
+          <w:lang w:val="en-US"/>
+        </w:rPr>
+        <w:t xml:space="preserve"> Data dan </w:t>
+      </w:r>
+      <w:proofErr w:type="spellStart"/>
+      <w:r>
+        <w:rPr>
+          <w:lang w:val="en-US"/>
+        </w:rPr>
+        <w:t>Informasi</w:t>
+      </w:r>
+      <w:proofErr w:type="spellEnd"/>
+      <w:r>
+        <w:rPr>
+          <w:lang w:val="en-US"/>
+        </w:rPr>
+        <w:t xml:space="preserve"> </w:t>
+      </w:r>
+      <w:proofErr w:type="spellStart"/>
+      <w:r>
+        <w:rPr>
+          <w:lang w:val="en-US"/>
+        </w:rPr>
+        <w:t>ini</w:t>
+      </w:r>
+      <w:proofErr w:type="spellEnd"/>
+      <w:r>
+        <w:rPr>
+          <w:lang w:val="en-US"/>
+        </w:rPr>
+        <w:t xml:space="preserve"> </w:t>
+      </w:r>
+      <w:proofErr w:type="spellStart"/>
+      <w:r>
+        <w:rPr>
+          <w:lang w:val="en-US"/>
+        </w:rPr>
+        <w:t>tidak</w:t>
+      </w:r>
+      <w:proofErr w:type="spellEnd"/>
+      <w:r>
+        <w:rPr>
+          <w:lang w:val="en-US"/>
+        </w:rPr>
+        <w:t xml:space="preserve"> </w:t>
+      </w:r>
+      <w:proofErr w:type="spellStart"/>
+      <w:r>
+        <w:rPr>
+          <w:lang w:val="en-US"/>
+        </w:rPr>
+        <w:t>sepenuhnya</w:t>
+      </w:r>
+      <w:proofErr w:type="spellEnd"/>
+      <w:r>
+        <w:rPr>
+          <w:lang w:val="en-US"/>
+        </w:rPr>
+        <w:t xml:space="preserve"> </w:t>
+      </w:r>
+      <w:proofErr w:type="spellStart"/>
       <w:r>
         <w:rPr>
           <w:lang w:val="en-US"/>
         </w:rPr>
         <w:t>menjadi</w:t>
       </w:r>
-      <w:r>
-        <w:rPr>
-          <w:lang w:val="en-US"/>
-        </w:rPr>
-        <w:t xml:space="preserve"> dasar perhitungan </w:t>
-      </w:r>
-      <w:r>
-        <w:rPr>
-          <w:lang w:val="en-US"/>
-        </w:rPr>
-        <w:t xml:space="preserve">kinerja Pemerintah Daerah dalam rangka </w:t>
+      <w:proofErr w:type="spellEnd"/>
+      <w:r>
+        <w:rPr>
+          <w:lang w:val="en-US"/>
+        </w:rPr>
+        <w:t xml:space="preserve"> </w:t>
+      </w:r>
+      <w:proofErr w:type="spellStart"/>
+      <w:r>
+        <w:rPr>
+          <w:lang w:val="en-US"/>
+        </w:rPr>
+        <w:t>dasar</w:t>
+      </w:r>
+      <w:proofErr w:type="spellEnd"/>
+      <w:r>
+        <w:rPr>
+          <w:lang w:val="en-US"/>
+        </w:rPr>
+        <w:t xml:space="preserve"> </w:t>
+      </w:r>
+      <w:proofErr w:type="spellStart"/>
+      <w:r>
+        <w:rPr>
+          <w:lang w:val="en-US"/>
+        </w:rPr>
+        <w:t>perhitungan</w:t>
+      </w:r>
+      <w:proofErr w:type="spellEnd"/>
+      <w:r>
+        <w:rPr>
+          <w:lang w:val="en-US"/>
+        </w:rPr>
+        <w:t xml:space="preserve"> </w:t>
+      </w:r>
+      <w:proofErr w:type="spellStart"/>
+      <w:r>
+        <w:rPr>
+          <w:lang w:val="en-US"/>
+        </w:rPr>
+        <w:t>kinerja</w:t>
+      </w:r>
+      <w:proofErr w:type="spellEnd"/>
+      <w:r>
+        <w:rPr>
+          <w:lang w:val="en-US"/>
+        </w:rPr>
+        <w:t xml:space="preserve"> </w:t>
+      </w:r>
+      <w:proofErr w:type="spellStart"/>
+      <w:r>
+        <w:rPr>
+          <w:lang w:val="en-US"/>
+        </w:rPr>
+        <w:t>Pemerintah</w:t>
+      </w:r>
+      <w:proofErr w:type="spellEnd"/>
+      <w:r>
+        <w:rPr>
+          <w:lang w:val="en-US"/>
+        </w:rPr>
+        <w:t xml:space="preserve"> Daerah </w:t>
+      </w:r>
+      <w:proofErr w:type="spellStart"/>
+      <w:r>
+        <w:rPr>
+          <w:lang w:val="en-US"/>
+        </w:rPr>
+        <w:t>dalam</w:t>
+      </w:r>
+      <w:proofErr w:type="spellEnd"/>
+      <w:r>
+        <w:rPr>
+          <w:lang w:val="en-US"/>
+        </w:rPr>
+        <w:t xml:space="preserve"> </w:t>
+      </w:r>
+      <w:proofErr w:type="spellStart"/>
+      <w:r>
+        <w:rPr>
+          <w:lang w:val="en-US"/>
+        </w:rPr>
+        <w:t>rangka</w:t>
+      </w:r>
+      <w:proofErr w:type="spellEnd"/>
+      <w:r>
+        <w:rPr>
+          <w:lang w:val="en-US"/>
+        </w:rPr>
+        <w:t xml:space="preserve"> </w:t>
       </w:r>
       <w:r>
         <w:rPr>
@@ -1409,12 +1890,21 @@
       <w:r>
         <w:t xml:space="preserve">hal yang memerlukan klarifikasi, </w:t>
       </w:r>
-      <w:r>
-        <w:rPr>
-          <w:lang w:val="en-US"/>
-        </w:rPr>
-        <w:t xml:space="preserve">akan </w:t>
-      </w:r>
+      <w:proofErr w:type="spellStart"/>
+      <w:r>
+        <w:rPr>
+          <w:lang w:val="en-US"/>
+        </w:rPr>
+        <w:t>akan</w:t>
+      </w:r>
+      <w:proofErr w:type="spellEnd"/>
+      <w:r>
+        <w:rPr>
+          <w:lang w:val="en-US"/>
+        </w:rPr>
+        <w:t xml:space="preserve"> </w:t>
+      </w:r>
+      <w:proofErr w:type="spellStart"/>
       <w:r>
         <w:rPr>
           <w:lang w:val="en-US"/>
@@ -1425,8 +1915,51 @@
         <w:rPr>
           <w:lang w:val="en-US"/>
         </w:rPr>
-        <w:t>sampaikan melalui surat tersendiri</w:t>
-      </w:r>
+        <w:t>sampaikan</w:t>
+      </w:r>
+      <w:proofErr w:type="spellEnd"/>
+      <w:r>
+        <w:rPr>
+          <w:lang w:val="en-US"/>
+        </w:rPr>
+        <w:t xml:space="preserve"> </w:t>
+      </w:r>
+      <w:proofErr w:type="spellStart"/>
+      <w:r>
+        <w:rPr>
+          <w:lang w:val="en-US"/>
+        </w:rPr>
+        <w:t>melalui</w:t>
+      </w:r>
+      <w:proofErr w:type="spellEnd"/>
+      <w:r>
+        <w:rPr>
+          <w:lang w:val="en-US"/>
+        </w:rPr>
+        <w:t xml:space="preserve"> </w:t>
+      </w:r>
+      <w:proofErr w:type="spellStart"/>
+      <w:r>
+        <w:rPr>
+          <w:lang w:val="en-US"/>
+        </w:rPr>
+        <w:t>surat</w:t>
+      </w:r>
+      <w:proofErr w:type="spellEnd"/>
+      <w:r>
+        <w:rPr>
+          <w:lang w:val="en-US"/>
+        </w:rPr>
+        <w:t xml:space="preserve"> </w:t>
+      </w:r>
+      <w:proofErr w:type="spellStart"/>
+      <w:r>
+        <w:rPr>
+          <w:lang w:val="en-US"/>
+        </w:rPr>
+        <w:t>tersendiri</w:t>
+      </w:r>
+      <w:proofErr w:type="spellEnd"/>
       <w:r>
         <w:rPr>
           <w:lang w:val="en-US"/>
@@ -1446,21 +1979,45 @@
           <w:lang w:val="en-US"/>
         </w:rPr>
       </w:pPr>
-      <w:r>
-        <w:rPr>
-          <w:lang w:val="en-US"/>
-        </w:rPr>
-        <w:t>Demikian disampaikan, a</w:t>
+      <w:proofErr w:type="spellStart"/>
+      <w:r>
+        <w:rPr>
+          <w:lang w:val="en-US"/>
+        </w:rPr>
+        <w:t>Demikian</w:t>
+      </w:r>
+      <w:proofErr w:type="spellEnd"/>
+      <w:r>
+        <w:rPr>
+          <w:lang w:val="en-US"/>
+        </w:rPr>
+        <w:t xml:space="preserve"> </w:t>
+      </w:r>
+      <w:proofErr w:type="spellStart"/>
+      <w:r>
+        <w:rPr>
+          <w:lang w:val="en-US"/>
+        </w:rPr>
+        <w:t>disampaikan</w:t>
+      </w:r>
+      <w:proofErr w:type="spellEnd"/>
+      <w:r>
+        <w:rPr>
+          <w:lang w:val="en-US"/>
+        </w:rPr>
+        <w:t>, a</w:t>
       </w:r>
       <w:r>
         <w:t xml:space="preserve">tas perhatian dan kerja sama </w:t>
       </w:r>
+      <w:proofErr w:type="spellStart"/>
       <w:r>
         <w:rPr>
           <w:lang w:val="en-US"/>
         </w:rPr>
         <w:t>Saudara</w:t>
       </w:r>
+      <w:proofErr w:type="spellEnd"/>
       <w:r>
         <w:rPr>
           <w:lang w:val="en-US"/>
@@ -1518,7 +2075,7 @@
                 <w:lang w:val="en-GB"/>
               </w:rPr>
             </w:pPr>
-            <w:hyperlink r:id="rId12" w:history="1"/>
+            <w:hyperlink r:id="rId10" w:history="1"/>
           </w:p>
         </w:tc>
         <w:tc>
@@ -1539,7 +2096,18 @@
             <w:r>
               <w:t>Direktur Data dan Informasi Perpajakan</w:t>
             </w:r>
-            <w:hyperlink r:id="rId13" w:history="1"/>
+            <w:r>
+              <w:fldChar w:fldCharType="begin"/>
+            </w:r>
+            <w:r>
+              <w:instrText>HYPERLINK "http://PENANDATANGAN"</w:instrText>
+            </w:r>
+            <w:r>
+              <w:fldChar w:fldCharType="separate"/>
+            </w:r>
+            <w:r>
+              <w:fldChar w:fldCharType="end"/>
+            </w:r>
           </w:p>
         </w:tc>
       </w:tr>
@@ -1677,34 +2245,38 @@
                 <w:lang w:val="en-US"/>
               </w:rPr>
             </w:pPr>
-            <w:hyperlink r:id="rId14" w:history="1">
-              <w:r>
-                <w:rPr>
-                  <w:rStyle w:val="Hyperlink"/>
-                  <w:rFonts w:cs="Arial"/>
-                  <w:noProof/>
-                  <w:color w:val="auto"/>
-                  <w:u w:val="none"/>
-                  <w:lang w:val="en-US"/>
-                </w:rPr>
-                <w:t>Max</w:t>
-              </w:r>
-            </w:hyperlink>
-            <w:r>
-              <w:rPr>
-                <w:rStyle w:val="Hyperlink"/>
-                <w:rFonts w:cs="Arial"/>
-                <w:noProof/>
-                <w:color w:val="auto"/>
-                <w:u w:val="none"/>
-                <w:lang w:val="en-US"/>
-              </w:rPr>
-              <w:t xml:space="preserve"> Darmawan</w:t>
+            <w:r>
+              <w:t>Eddy Wahyudi</w:t>
             </w:r>
           </w:p>
         </w:tc>
       </w:tr>
     </w:tbl>
+    <w:p>
+      <w:pPr>
+        <w:ind w:left="-284"/>
+        <w:jc w:val="both"/>
+        <w:rPr>
+          <w:rFonts w:eastAsia="Arial" w:cs="Arial"/>
+          <w:noProof/>
+        </w:rPr>
+      </w:pPr>
+    </w:p>
+    <w:p>
+      <w:pPr>
+        <w:rPr>
+          <w:rFonts w:eastAsia="Arial" w:cs="Arial"/>
+          <w:noProof/>
+        </w:rPr>
+      </w:pPr>
+      <w:r>
+        <w:rPr>
+          <w:rFonts w:eastAsia="Arial" w:cs="Arial"/>
+          <w:noProof/>
+        </w:rPr>
+        <w:br w:type="page"/>
+      </w:r>
+    </w:p>
     <w:p>
       <w:pPr>
         <w:ind w:left="-284"/>
@@ -1825,7 +2397,7 @@
         </w:rPr>
         <w:t xml:space="preserve">: </w:t>
       </w:r>
-      <w:hyperlink r:id="rId15" w:history="1">
+      <w:hyperlink r:id="rId11" w:history="1">
         <w:r>
           <w:rPr>
             <w:rStyle w:val="Hyperlink"/>
@@ -1871,7 +2443,7 @@
         </w:rPr>
         <w:t xml:space="preserve">: </w:t>
       </w:r>
-      <w:hyperlink r:id="rId16" w:history="1">
+      <w:hyperlink r:id="rId12" w:history="1">
         <w:r>
           <w:rPr>
             <w:rFonts w:eastAsia="Arial" w:cs="Arial"/>
@@ -1908,7 +2480,23 @@
           <w:b/>
           <w:bCs/>
         </w:rPr>
-        <w:t>Daftar Rincian Jenis Data</w:t>
+        <w:t xml:space="preserve">Daftar </w:t>
+      </w:r>
+      <w:proofErr w:type="spellStart"/>
+      <w:r>
+        <w:rPr>
+          <w:b/>
+          <w:bCs/>
+        </w:rPr>
+        <w:t>Rincian</w:t>
+      </w:r>
+      <w:proofErr w:type="spellEnd"/>
+      <w:r>
+        <w:rPr>
+          <w:b/>
+          <w:bCs/>
+        </w:rPr>
+        <w:t xml:space="preserve"> Jenis Data</w:t>
       </w:r>
     </w:p>
     <w:p>
@@ -1935,10 +2523,25 @@
       <w:r>
         <w:rPr>
           <w:rFonts w:cs="Arial"/>
-          <w:highlight w:val="yellow"/>
-          <w:lang w:val="en-US"/>
-        </w:rPr>
-        <w:t>Kabupaten Pemalang</w:t>
+          <w:lang w:val="en-US"/>
+        </w:rPr>
+        <w:t>{{</w:t>
+      </w:r>
+      <w:proofErr w:type="spellStart"/>
+      <w:r>
+        <w:rPr>
+          <w:rFonts w:cs="Arial"/>
+          <w:lang w:val="en-US"/>
+        </w:rPr>
+        <w:t>nama_ilap</w:t>
+      </w:r>
+      <w:proofErr w:type="spellEnd"/>
+      <w:r>
+        <w:rPr>
+          <w:rFonts w:cs="Arial"/>
+          <w:lang w:val="en-US"/>
+        </w:rPr>
+        <w:t>}}</w:t>
       </w:r>
     </w:p>
     <w:p>
@@ -1960,12 +2563,12 @@
         <w:tblLook w:val="04A0" w:firstRow="1" w:lastRow="0" w:firstColumn="1" w:lastColumn="0" w:noHBand="0" w:noVBand="1"/>
       </w:tblPr>
       <w:tblGrid>
-        <w:gridCol w:w="582"/>
-        <w:gridCol w:w="4358"/>
-        <w:gridCol w:w="1110"/>
-        <w:gridCol w:w="1177"/>
-        <w:gridCol w:w="1203"/>
-        <w:gridCol w:w="1203"/>
+        <w:gridCol w:w="1013"/>
+        <w:gridCol w:w="1415"/>
+        <w:gridCol w:w="1407"/>
+        <w:gridCol w:w="1925"/>
+        <w:gridCol w:w="1776"/>
+        <w:gridCol w:w="2097"/>
       </w:tblGrid>
       <w:tr>
         <w:trPr>
@@ -1974,7 +2577,7 @@
         </w:trPr>
         <w:tc>
           <w:tcPr>
-            <w:tcW w:w="587" w:type="dxa"/>
+            <w:tcW w:w="584" w:type="dxa"/>
             <w:tcBorders>
               <w:top w:val="single" w:sz="4" w:space="0" w:color="auto"/>
               <w:left w:val="single" w:sz="4" w:space="0" w:color="auto"/>
@@ -2012,7 +2615,7 @@
         </w:tc>
         <w:tc>
           <w:tcPr>
-            <w:tcW w:w="4600" w:type="dxa"/>
+            <w:tcW w:w="4356" w:type="dxa"/>
             <w:tcBorders>
               <w:top w:val="single" w:sz="4" w:space="0" w:color="auto"/>
               <w:left w:val="nil"/>
@@ -2050,7 +2653,7 @@
         </w:tc>
         <w:tc>
           <w:tcPr>
-            <w:tcW w:w="1111" w:type="dxa"/>
+            <w:tcW w:w="1110" w:type="dxa"/>
             <w:tcBorders>
               <w:top w:val="single" w:sz="4" w:space="0" w:color="auto"/>
               <w:left w:val="nil"/>
@@ -2073,6 +2676,7 @@
                 <w:lang w:val="en-ID" w:eastAsia="en-ID"/>
               </w:rPr>
             </w:pPr>
+            <w:proofErr w:type="spellStart"/>
             <w:r>
               <w:rPr>
                 <w:rFonts w:eastAsia="Times New Roman" w:cs="Arial"/>
@@ -2082,7 +2686,19 @@
                 <w:szCs w:val="24"/>
                 <w:lang w:val="en-ID" w:eastAsia="en-ID"/>
               </w:rPr>
-              <w:t>Periode Data</w:t>
+              <w:t>Periode</w:t>
+            </w:r>
+            <w:proofErr w:type="spellEnd"/>
+            <w:r>
+              <w:rPr>
+                <w:rFonts w:eastAsia="Times New Roman" w:cs="Arial"/>
+                <w:b/>
+                <w:bCs/>
+                <w:sz w:val="24"/>
+                <w:szCs w:val="24"/>
+                <w:lang w:val="en-ID" w:eastAsia="en-ID"/>
+              </w:rPr>
+              <w:t xml:space="preserve"> Data</w:t>
             </w:r>
           </w:p>
         </w:tc>
@@ -2111,6 +2727,7 @@
                 <w:lang w:val="en-ID" w:eastAsia="en-ID"/>
               </w:rPr>
             </w:pPr>
+            <w:proofErr w:type="spellStart"/>
             <w:r>
               <w:rPr>
                 <w:rFonts w:eastAsia="Times New Roman" w:cs="Arial"/>
@@ -2120,8 +2737,9 @@
                 <w:szCs w:val="24"/>
                 <w:lang w:val="en-ID" w:eastAsia="en-ID"/>
               </w:rPr>
-              <w:t>Jumlah Baris Data</w:t>
-            </w:r>
+              <w:t>Jumlah</w:t>
+            </w:r>
+            <w:proofErr w:type="spellEnd"/>
             <w:r>
               <w:rPr>
                 <w:rFonts w:eastAsia="Times New Roman" w:cs="Arial"/>
@@ -2131,8 +2749,32 @@
                 <w:szCs w:val="24"/>
                 <w:lang w:val="en-ID" w:eastAsia="en-ID"/>
               </w:rPr>
-              <w:t xml:space="preserve"> Diterima</w:t>
-            </w:r>
+              <w:t xml:space="preserve"> Baris Data</w:t>
+            </w:r>
+            <w:r>
+              <w:rPr>
+                <w:rFonts w:eastAsia="Times New Roman" w:cs="Arial"/>
+                <w:b/>
+                <w:bCs/>
+                <w:sz w:val="24"/>
+                <w:szCs w:val="24"/>
+                <w:lang w:val="en-ID" w:eastAsia="en-ID"/>
+              </w:rPr>
+              <w:t xml:space="preserve"> </w:t>
+            </w:r>
+            <w:proofErr w:type="spellStart"/>
+            <w:r>
+              <w:rPr>
+                <w:rFonts w:eastAsia="Times New Roman" w:cs="Arial"/>
+                <w:b/>
+                <w:bCs/>
+                <w:sz w:val="24"/>
+                <w:szCs w:val="24"/>
+                <w:lang w:val="en-ID" w:eastAsia="en-ID"/>
+              </w:rPr>
+              <w:t>Diterima</w:t>
+            </w:r>
+            <w:proofErr w:type="spellEnd"/>
           </w:p>
         </w:tc>
         <w:tc>
@@ -2159,6 +2801,7 @@
                 <w:lang w:val="en-ID" w:eastAsia="en-ID"/>
               </w:rPr>
             </w:pPr>
+            <w:proofErr w:type="spellStart"/>
             <w:r>
               <w:rPr>
                 <w:rFonts w:eastAsia="Times New Roman" w:cs="Arial"/>
@@ -2168,13 +2811,38 @@
                 <w:szCs w:val="24"/>
                 <w:lang w:val="en-ID" w:eastAsia="en-ID"/>
               </w:rPr>
-              <w:t>Jumlah Baris Data Lengkap</w:t>
-            </w:r>
-          </w:p>
-        </w:tc>
-        <w:tc>
-          <w:tcPr>
-            <w:tcW w:w="955" w:type="dxa"/>
+              <w:t>Jumlah</w:t>
+            </w:r>
+            <w:proofErr w:type="spellEnd"/>
+            <w:r>
+              <w:rPr>
+                <w:rFonts w:eastAsia="Times New Roman" w:cs="Arial"/>
+                <w:b/>
+                <w:bCs/>
+                <w:sz w:val="24"/>
+                <w:szCs w:val="24"/>
+                <w:lang w:val="en-ID" w:eastAsia="en-ID"/>
+              </w:rPr>
+              <w:t xml:space="preserve"> Baris Data </w:t>
+            </w:r>
+            <w:proofErr w:type="spellStart"/>
+            <w:r>
+              <w:rPr>
+                <w:rFonts w:eastAsia="Times New Roman" w:cs="Arial"/>
+                <w:b/>
+                <w:bCs/>
+                <w:sz w:val="24"/>
+                <w:szCs w:val="24"/>
+                <w:lang w:val="en-ID" w:eastAsia="en-ID"/>
+              </w:rPr>
+              <w:t>Lengkap</w:t>
+            </w:r>
+            <w:proofErr w:type="spellEnd"/>
+          </w:p>
+        </w:tc>
+        <w:tc>
+          <w:tcPr>
+            <w:tcW w:w="1203" w:type="dxa"/>
             <w:tcBorders>
               <w:top w:val="single" w:sz="4" w:space="0" w:color="auto"/>
               <w:left w:val="nil"/>
@@ -2195,6 +2863,7 @@
                 <w:lang w:val="en-ID" w:eastAsia="en-ID"/>
               </w:rPr>
             </w:pPr>
+            <w:proofErr w:type="spellStart"/>
             <w:r>
               <w:rPr>
                 <w:rFonts w:eastAsia="Times New Roman" w:cs="Arial"/>
@@ -2204,8 +2873,33 @@
                 <w:szCs w:val="24"/>
                 <w:lang w:val="en-ID" w:eastAsia="en-ID"/>
               </w:rPr>
-              <w:t>Jumlah Baris Data Tidak Lengkap</w:t>
-            </w:r>
+              <w:t>Jumlah</w:t>
+            </w:r>
+            <w:proofErr w:type="spellEnd"/>
+            <w:r>
+              <w:rPr>
+                <w:rFonts w:eastAsia="Times New Roman" w:cs="Arial"/>
+                <w:b/>
+                <w:bCs/>
+                <w:sz w:val="24"/>
+                <w:szCs w:val="24"/>
+                <w:lang w:val="en-ID" w:eastAsia="en-ID"/>
+              </w:rPr>
+              <w:t xml:space="preserve"> Baris Data Tidak </w:t>
+            </w:r>
+            <w:proofErr w:type="spellStart"/>
+            <w:r>
+              <w:rPr>
+                <w:rFonts w:eastAsia="Times New Roman" w:cs="Arial"/>
+                <w:b/>
+                <w:bCs/>
+                <w:sz w:val="24"/>
+                <w:szCs w:val="24"/>
+                <w:lang w:val="en-ID" w:eastAsia="en-ID"/>
+              </w:rPr>
+              <w:t>Lengkap</w:t>
+            </w:r>
+            <w:proofErr w:type="spellEnd"/>
           </w:p>
         </w:tc>
       </w:tr>
@@ -2215,15 +2909,13 @@
         </w:trPr>
         <w:tc>
           <w:tcPr>
-            <w:tcW w:w="587" w:type="dxa"/>
+            <w:tcW w:w="584" w:type="dxa"/>
             <w:tcBorders>
               <w:top w:val="nil"/>
               <w:left w:val="single" w:sz="4" w:space="0" w:color="auto"/>
               <w:bottom w:val="single" w:sz="4" w:space="0" w:color="auto"/>
               <w:right w:val="single" w:sz="4" w:space="0" w:color="auto"/>
             </w:tcBorders>
-            <w:vAlign w:val="center"/>
-            <w:hideMark/>
           </w:tcPr>
           <w:p>
             <w:pPr>
@@ -2237,23 +2929,45 @@
             <w:r>
               <w:rPr>
                 <w:rFonts w:eastAsia="Times New Roman" w:cs="Arial"/>
-                <w:highlight w:val="yellow"/>
+                <w:sz w:val="24"/>
+                <w:szCs w:val="24"/>
                 <w:lang w:val="en-ID" w:eastAsia="en-ID"/>
               </w:rPr>
-              <w:t>1</w:t>
-            </w:r>
-          </w:p>
-        </w:tc>
-        <w:tc>
-          <w:tcPr>
-            <w:tcW w:w="4600" w:type="dxa"/>
+              <w:t>{{</w:t>
+            </w:r>
+            <w:proofErr w:type="spellStart"/>
+            <w:proofErr w:type="gramStart"/>
+            <w:r>
+              <w:rPr>
+                <w:rFonts w:eastAsia="Times New Roman" w:cs="Arial"/>
+                <w:sz w:val="24"/>
+                <w:szCs w:val="24"/>
+                <w:lang w:val="en-ID" w:eastAsia="en-ID"/>
+              </w:rPr>
+              <w:t>row.nomor</w:t>
+            </w:r>
+            <w:proofErr w:type="spellEnd"/>
+            <w:proofErr w:type="gramEnd"/>
+            <w:r>
+              <w:rPr>
+                <w:rFonts w:eastAsia="Times New Roman" w:cs="Arial"/>
+                <w:sz w:val="24"/>
+                <w:szCs w:val="24"/>
+                <w:lang w:val="en-ID" w:eastAsia="en-ID"/>
+              </w:rPr>
+              <w:t>}}</w:t>
+            </w:r>
+          </w:p>
+        </w:tc>
+        <w:tc>
+          <w:tcPr>
+            <w:tcW w:w="4356" w:type="dxa"/>
             <w:tcBorders>
               <w:top w:val="nil"/>
               <w:left w:val="nil"/>
               <w:bottom w:val="single" w:sz="4" w:space="0" w:color="auto"/>
               <w:right w:val="single" w:sz="4" w:space="0" w:color="auto"/>
             </w:tcBorders>
-            <w:vAlign w:val="center"/>
           </w:tcPr>
           <w:p>
             <w:pPr>
@@ -2266,23 +2980,41 @@
             </w:pPr>
             <w:r>
               <w:rPr>
-                <w:rFonts w:cs="Arial"/>
-                <w:highlight w:val="yellow"/>
-              </w:rPr>
-              <w:t>Data Kepemilikan Hotel/Penginapan</w:t>
-            </w:r>
-          </w:p>
-        </w:tc>
-        <w:tc>
-          <w:tcPr>
-            <w:tcW w:w="1111" w:type="dxa"/>
+                <w:rFonts w:eastAsia="Times New Roman" w:cs="Arial"/>
+                <w:color w:val="auto"/>
+                <w:lang w:val="en-US" w:eastAsia="en-ID"/>
+              </w:rPr>
+              <w:t>{{</w:t>
+            </w:r>
+            <w:proofErr w:type="spellStart"/>
+            <w:r>
+              <w:rPr>
+                <w:rFonts w:eastAsia="Times New Roman" w:cs="Arial"/>
+                <w:color w:val="auto"/>
+                <w:lang w:val="en-US" w:eastAsia="en-ID"/>
+              </w:rPr>
+              <w:t>row.sub_jenis_data</w:t>
+            </w:r>
+            <w:proofErr w:type="spellEnd"/>
+            <w:r>
+              <w:rPr>
+                <w:rFonts w:eastAsia="Times New Roman" w:cs="Arial"/>
+                <w:color w:val="auto"/>
+                <w:lang w:val="en-US" w:eastAsia="en-ID"/>
+              </w:rPr>
+              <w:t>}}</w:t>
+            </w:r>
+          </w:p>
+        </w:tc>
+        <w:tc>
+          <w:tcPr>
+            <w:tcW w:w="1110" w:type="dxa"/>
             <w:tcBorders>
               <w:top w:val="nil"/>
               <w:left w:val="nil"/>
               <w:bottom w:val="single" w:sz="4" w:space="0" w:color="auto"/>
               <w:right w:val="single" w:sz="4" w:space="0" w:color="auto"/>
             </w:tcBorders>
-            <w:vAlign w:val="center"/>
           </w:tcPr>
           <w:p>
             <w:pPr>
@@ -2295,18 +3027,43 @@
             </w:pPr>
             <w:r>
               <w:rPr>
-                <w:rFonts w:cs="Arial"/>
-                <w:highlight w:val="yellow"/>
-              </w:rPr>
-              <w:t>202</w:t>
-            </w:r>
-            <w:r>
-              <w:rPr>
-                <w:rFonts w:cs="Arial"/>
-                <w:highlight w:val="yellow"/>
-                <w:lang w:val="en-US"/>
-              </w:rPr>
-              <w:t>4</w:t>
+                <w:rFonts w:eastAsia="Times New Roman" w:cs="Arial"/>
+                <w:sz w:val="24"/>
+                <w:szCs w:val="24"/>
+                <w:lang w:val="en-US" w:eastAsia="en-ID"/>
+              </w:rPr>
+              <w:t>{{</w:t>
+            </w:r>
+            <w:proofErr w:type="spellStart"/>
+            <w:proofErr w:type="gramStart"/>
+            <w:r>
+              <w:rPr>
+                <w:rFonts w:eastAsia="Times New Roman" w:cs="Arial"/>
+                <w:sz w:val="24"/>
+                <w:szCs w:val="24"/>
+                <w:lang w:val="en-US" w:eastAsia="en-ID"/>
+              </w:rPr>
+              <w:t>row.periode</w:t>
+            </w:r>
+            <w:proofErr w:type="gramEnd"/>
+            <w:r>
+              <w:rPr>
+                <w:rFonts w:eastAsia="Times New Roman" w:cs="Arial"/>
+                <w:sz w:val="24"/>
+                <w:szCs w:val="24"/>
+                <w:lang w:val="en-US" w:eastAsia="en-ID"/>
+              </w:rPr>
+              <w:t>_data</w:t>
+            </w:r>
+            <w:proofErr w:type="spellEnd"/>
+            <w:r>
+              <w:rPr>
+                <w:rFonts w:eastAsia="Times New Roman" w:cs="Arial"/>
+                <w:sz w:val="24"/>
+                <w:szCs w:val="24"/>
+                <w:lang w:val="en-US" w:eastAsia="en-ID"/>
+              </w:rPr>
+              <w:t>}}</w:t>
             </w:r>
           </w:p>
         </w:tc>
@@ -2319,7 +3076,6 @@
               <w:bottom w:val="single" w:sz="4" w:space="0" w:color="auto"/>
               <w:right w:val="single" w:sz="4" w:space="0" w:color="auto"/>
             </w:tcBorders>
-            <w:vAlign w:val="center"/>
           </w:tcPr>
           <w:p>
             <w:pPr>
@@ -2332,11 +3088,43 @@
             </w:pPr>
             <w:r>
               <w:rPr>
-                <w:rFonts w:cs="Arial"/>
-                <w:highlight w:val="yellow"/>
-                <w:lang w:val="en-US"/>
-              </w:rPr>
-              <w:t>100</w:t>
+                <w:rFonts w:eastAsia="Times New Roman" w:cs="Arial"/>
+                <w:sz w:val="24"/>
+                <w:szCs w:val="24"/>
+                <w:lang w:val="en-US" w:eastAsia="en-ID"/>
+              </w:rPr>
+              <w:t>{{</w:t>
+            </w:r>
+            <w:proofErr w:type="spellStart"/>
+            <w:proofErr w:type="gramStart"/>
+            <w:r>
+              <w:rPr>
+                <w:rFonts w:eastAsia="Times New Roman" w:cs="Arial"/>
+                <w:sz w:val="24"/>
+                <w:szCs w:val="24"/>
+                <w:lang w:val="en-US" w:eastAsia="en-ID"/>
+              </w:rPr>
+              <w:t>row.jumlah</w:t>
+            </w:r>
+            <w:proofErr w:type="gramEnd"/>
+            <w:r>
+              <w:rPr>
+                <w:rFonts w:eastAsia="Times New Roman" w:cs="Arial"/>
+                <w:sz w:val="24"/>
+                <w:szCs w:val="24"/>
+                <w:lang w:val="en-US" w:eastAsia="en-ID"/>
+              </w:rPr>
+              <w:t>_baris_diterima</w:t>
+            </w:r>
+            <w:proofErr w:type="spellEnd"/>
+            <w:r>
+              <w:rPr>
+                <w:rFonts w:eastAsia="Times New Roman" w:cs="Arial"/>
+                <w:sz w:val="24"/>
+                <w:szCs w:val="24"/>
+                <w:lang w:val="en-US" w:eastAsia="en-ID"/>
+              </w:rPr>
+              <w:t>}}</w:t>
             </w:r>
           </w:p>
         </w:tc>
@@ -2349,7 +3137,6 @@
               <w:bottom w:val="single" w:sz="4" w:space="0" w:color="auto"/>
               <w:right w:val="single" w:sz="4" w:space="0" w:color="auto"/>
             </w:tcBorders>
-            <w:vAlign w:val="center"/>
           </w:tcPr>
           <w:p>
             <w:pPr>
@@ -2363,23 +3150,34 @@
             <w:r>
               <w:rPr>
                 <w:rFonts w:cs="Arial"/>
-                <w:highlight w:val="yellow"/>
-                <w:lang w:val="en-US"/>
-              </w:rPr>
-              <w:t>80</w:t>
-            </w:r>
-          </w:p>
-        </w:tc>
-        <w:tc>
-          <w:tcPr>
-            <w:tcW w:w="955" w:type="dxa"/>
+              </w:rPr>
+              <w:t>{{</w:t>
+            </w:r>
+            <w:proofErr w:type="spellStart"/>
+            <w:r>
+              <w:rPr>
+                <w:rFonts w:cs="Arial"/>
+              </w:rPr>
+              <w:t>row.jumlah_baris_lengkap</w:t>
+            </w:r>
+            <w:proofErr w:type="spellEnd"/>
+            <w:r>
+              <w:rPr>
+                <w:rFonts w:cs="Arial"/>
+              </w:rPr>
+              <w:t>}}</w:t>
+            </w:r>
+          </w:p>
+        </w:tc>
+        <w:tc>
+          <w:tcPr>
+            <w:tcW w:w="1203" w:type="dxa"/>
             <w:tcBorders>
               <w:top w:val="nil"/>
               <w:left w:val="nil"/>
               <w:bottom w:val="single" w:sz="4" w:space="0" w:color="auto"/>
               <w:right w:val="single" w:sz="4" w:space="0" w:color="auto"/>
             </w:tcBorders>
-            <w:vAlign w:val="center"/>
           </w:tcPr>
           <w:p>
             <w:pPr>
@@ -2393,583 +3191,34 @@
             <w:r>
               <w:rPr>
                 <w:rFonts w:cs="Arial"/>
-                <w:highlight w:val="yellow"/>
-                <w:lang w:val="en-US"/>
-              </w:rPr>
-              <w:t>20</w:t>
-            </w:r>
-          </w:p>
-        </w:tc>
-      </w:tr>
-      <w:tr>
-        <w:trPr>
-          <w:trHeight w:val="386"/>
-        </w:trPr>
-        <w:tc>
-          <w:tcPr>
-            <w:tcW w:w="587" w:type="dxa"/>
-            <w:tcBorders>
-              <w:top w:val="single" w:sz="4" w:space="0" w:color="auto"/>
-              <w:left w:val="single" w:sz="4" w:space="0" w:color="auto"/>
-              <w:bottom w:val="single" w:sz="4" w:space="0" w:color="auto"/>
-              <w:right w:val="single" w:sz="4" w:space="0" w:color="auto"/>
-            </w:tcBorders>
-            <w:vAlign w:val="center"/>
-          </w:tcPr>
-          <w:p>
-            <w:pPr>
-              <w:jc w:val="center"/>
-              <w:rPr>
-                <w:rFonts w:eastAsia="Times New Roman" w:cs="Arial"/>
-                <w:highlight w:val="yellow"/>
-                <w:lang w:val="en-ID" w:eastAsia="en-ID"/>
-              </w:rPr>
-            </w:pPr>
-            <w:r>
-              <w:rPr>
-                <w:rFonts w:eastAsia="Times New Roman" w:cs="Arial"/>
-                <w:highlight w:val="yellow"/>
-                <w:lang w:val="en-ID" w:eastAsia="en-ID"/>
-              </w:rPr>
-              <w:t>2</w:t>
-            </w:r>
-          </w:p>
-        </w:tc>
-        <w:tc>
-          <w:tcPr>
-            <w:tcW w:w="4600" w:type="dxa"/>
-            <w:tcBorders>
-              <w:top w:val="single" w:sz="4" w:space="0" w:color="auto"/>
-              <w:left w:val="nil"/>
-              <w:bottom w:val="single" w:sz="4" w:space="0" w:color="auto"/>
-              <w:right w:val="single" w:sz="4" w:space="0" w:color="auto"/>
-            </w:tcBorders>
-            <w:vAlign w:val="center"/>
-          </w:tcPr>
-          <w:p>
-            <w:pPr>
+              </w:rPr>
+              <w:t>{{</w:t>
+            </w:r>
+            <w:proofErr w:type="spellStart"/>
+            <w:r>
               <w:rPr>
                 <w:rFonts w:cs="Arial"/>
-                <w:highlight w:val="yellow"/>
-              </w:rPr>
-            </w:pPr>
+              </w:rPr>
+              <w:t>row.jumlah_baris_</w:t>
+            </w:r>
             <w:r>
               <w:rPr>
                 <w:rFonts w:cs="Arial"/>
-                <w:highlight w:val="yellow"/>
-              </w:rPr>
-              <w:t>Data Kepemilikan Restoran</w:t>
-            </w:r>
-          </w:p>
-        </w:tc>
-        <w:tc>
-          <w:tcPr>
-            <w:tcW w:w="1111" w:type="dxa"/>
-            <w:tcBorders>
-              <w:top w:val="single" w:sz="4" w:space="0" w:color="auto"/>
-              <w:left w:val="nil"/>
-              <w:bottom w:val="single" w:sz="4" w:space="0" w:color="auto"/>
-              <w:right w:val="single" w:sz="4" w:space="0" w:color="auto"/>
-            </w:tcBorders>
-            <w:vAlign w:val="center"/>
-          </w:tcPr>
-          <w:p>
-            <w:pPr>
-              <w:jc w:val="center"/>
+              </w:rPr>
+              <w:t>tidak_</w:t>
+            </w:r>
+            <w:r>
               <w:rPr>
                 <w:rFonts w:cs="Arial"/>
-                <w:highlight w:val="yellow"/>
-              </w:rPr>
-            </w:pPr>
+              </w:rPr>
+              <w:t>lengkap</w:t>
+            </w:r>
+            <w:proofErr w:type="spellEnd"/>
             <w:r>
               <w:rPr>
                 <w:rFonts w:cs="Arial"/>
-                <w:highlight w:val="yellow"/>
-              </w:rPr>
-              <w:t>202</w:t>
-            </w:r>
-            <w:r>
-              <w:rPr>
-                <w:rFonts w:cs="Arial"/>
-                <w:highlight w:val="yellow"/>
-                <w:lang w:val="en-US"/>
-              </w:rPr>
-              <w:t>4</w:t>
-            </w:r>
-          </w:p>
-        </w:tc>
-        <w:tc>
-          <w:tcPr>
-            <w:tcW w:w="1177" w:type="dxa"/>
-            <w:tcBorders>
-              <w:top w:val="single" w:sz="4" w:space="0" w:color="auto"/>
-              <w:left w:val="nil"/>
-              <w:bottom w:val="single" w:sz="4" w:space="0" w:color="auto"/>
-              <w:right w:val="single" w:sz="4" w:space="0" w:color="auto"/>
-            </w:tcBorders>
-            <w:vAlign w:val="center"/>
-          </w:tcPr>
-          <w:p>
-            <w:pPr>
-              <w:jc w:val="center"/>
-              <w:rPr>
-                <w:rFonts w:cs="Arial"/>
-                <w:highlight w:val="yellow"/>
-                <w:lang w:val="en-US"/>
-              </w:rPr>
-            </w:pPr>
-            <w:r>
-              <w:rPr>
-                <w:rFonts w:cs="Arial"/>
-                <w:highlight w:val="yellow"/>
-                <w:lang w:val="en-US"/>
-              </w:rPr>
-              <w:t>500</w:t>
-            </w:r>
-          </w:p>
-        </w:tc>
-        <w:tc>
-          <w:tcPr>
-            <w:tcW w:w="1203" w:type="dxa"/>
-            <w:tcBorders>
-              <w:top w:val="single" w:sz="4" w:space="0" w:color="auto"/>
-              <w:left w:val="nil"/>
-              <w:bottom w:val="single" w:sz="4" w:space="0" w:color="auto"/>
-              <w:right w:val="single" w:sz="4" w:space="0" w:color="auto"/>
-            </w:tcBorders>
-            <w:vAlign w:val="center"/>
-          </w:tcPr>
-          <w:p>
-            <w:pPr>
-              <w:jc w:val="center"/>
-              <w:rPr>
-                <w:rFonts w:cs="Arial"/>
-                <w:highlight w:val="yellow"/>
-                <w:lang w:val="en-US"/>
-              </w:rPr>
-            </w:pPr>
-            <w:r>
-              <w:rPr>
-                <w:rFonts w:cs="Arial"/>
-                <w:highlight w:val="yellow"/>
-                <w:lang w:val="en-US"/>
-              </w:rPr>
-              <w:t>400</w:t>
-            </w:r>
-          </w:p>
-        </w:tc>
-        <w:tc>
-          <w:tcPr>
-            <w:tcW w:w="955" w:type="dxa"/>
-            <w:tcBorders>
-              <w:top w:val="single" w:sz="4" w:space="0" w:color="auto"/>
-              <w:left w:val="nil"/>
-              <w:bottom w:val="single" w:sz="4" w:space="0" w:color="auto"/>
-              <w:right w:val="single" w:sz="4" w:space="0" w:color="auto"/>
-            </w:tcBorders>
-            <w:vAlign w:val="center"/>
-          </w:tcPr>
-          <w:p>
-            <w:pPr>
-              <w:jc w:val="center"/>
-              <w:rPr>
-                <w:rFonts w:cs="Arial"/>
-                <w:highlight w:val="yellow"/>
-                <w:lang w:val="en-US"/>
-              </w:rPr>
-            </w:pPr>
-            <w:r>
-              <w:rPr>
-                <w:rFonts w:cs="Arial"/>
-                <w:highlight w:val="yellow"/>
-                <w:lang w:val="en-US"/>
-              </w:rPr>
-              <w:t>100</w:t>
-            </w:r>
-          </w:p>
-        </w:tc>
-      </w:tr>
-      <w:tr>
-        <w:trPr>
-          <w:trHeight w:val="386"/>
-        </w:trPr>
-        <w:tc>
-          <w:tcPr>
-            <w:tcW w:w="587" w:type="dxa"/>
-            <w:tcBorders>
-              <w:top w:val="single" w:sz="4" w:space="0" w:color="auto"/>
-              <w:left w:val="single" w:sz="4" w:space="0" w:color="auto"/>
-              <w:bottom w:val="single" w:sz="4" w:space="0" w:color="auto"/>
-              <w:right w:val="single" w:sz="4" w:space="0" w:color="auto"/>
-            </w:tcBorders>
-            <w:vAlign w:val="center"/>
-          </w:tcPr>
-          <w:p>
-            <w:pPr>
-              <w:jc w:val="center"/>
-              <w:rPr>
-                <w:rFonts w:eastAsia="Times New Roman" w:cs="Arial"/>
-                <w:highlight w:val="yellow"/>
-                <w:lang w:val="en-ID" w:eastAsia="en-ID"/>
-              </w:rPr>
-            </w:pPr>
-            <w:r>
-              <w:rPr>
-                <w:rFonts w:eastAsia="Times New Roman" w:cs="Arial"/>
-                <w:highlight w:val="yellow"/>
-                <w:lang w:val="en-ID" w:eastAsia="en-ID"/>
-              </w:rPr>
-              <w:t>3</w:t>
-            </w:r>
-          </w:p>
-        </w:tc>
-        <w:tc>
-          <w:tcPr>
-            <w:tcW w:w="4600" w:type="dxa"/>
-            <w:tcBorders>
-              <w:top w:val="single" w:sz="4" w:space="0" w:color="auto"/>
-              <w:left w:val="nil"/>
-              <w:bottom w:val="single" w:sz="4" w:space="0" w:color="auto"/>
-              <w:right w:val="single" w:sz="4" w:space="0" w:color="auto"/>
-            </w:tcBorders>
-            <w:vAlign w:val="center"/>
-          </w:tcPr>
-          <w:p>
-            <w:pPr>
-              <w:rPr>
-                <w:rFonts w:cs="Arial"/>
-                <w:highlight w:val="yellow"/>
-              </w:rPr>
-            </w:pPr>
-            <w:r>
-              <w:rPr>
-                <w:rFonts w:cs="Arial"/>
-                <w:highlight w:val="yellow"/>
-              </w:rPr>
-              <w:t>Data Izin Mendirikan Bangunan (I</w:t>
-            </w:r>
-            <w:r>
-              <w:rPr>
-                <w:rFonts w:cs="Arial"/>
-                <w:highlight w:val="yellow"/>
-                <w:lang w:val="en-US"/>
-              </w:rPr>
-              <w:t>MB</w:t>
-            </w:r>
-            <w:r>
-              <w:rPr>
-                <w:rFonts w:cs="Arial"/>
-                <w:highlight w:val="yellow"/>
-              </w:rPr>
-              <w:t>)</w:t>
-            </w:r>
-          </w:p>
-        </w:tc>
-        <w:tc>
-          <w:tcPr>
-            <w:tcW w:w="1111" w:type="dxa"/>
-            <w:tcBorders>
-              <w:top w:val="single" w:sz="4" w:space="0" w:color="auto"/>
-              <w:left w:val="nil"/>
-              <w:bottom w:val="single" w:sz="4" w:space="0" w:color="auto"/>
-              <w:right w:val="single" w:sz="4" w:space="0" w:color="auto"/>
-            </w:tcBorders>
-            <w:vAlign w:val="center"/>
-          </w:tcPr>
-          <w:p>
-            <w:pPr>
-              <w:jc w:val="center"/>
-              <w:rPr>
-                <w:rFonts w:cs="Arial"/>
-                <w:highlight w:val="yellow"/>
-              </w:rPr>
-            </w:pPr>
-            <w:r>
-              <w:rPr>
-                <w:rFonts w:cs="Arial"/>
-                <w:highlight w:val="yellow"/>
-              </w:rPr>
-              <w:t>202</w:t>
-            </w:r>
-            <w:r>
-              <w:rPr>
-                <w:rFonts w:cs="Arial"/>
-                <w:highlight w:val="yellow"/>
-                <w:lang w:val="en-US"/>
-              </w:rPr>
-              <w:t>4</w:t>
-            </w:r>
-          </w:p>
-        </w:tc>
-        <w:tc>
-          <w:tcPr>
-            <w:tcW w:w="1177" w:type="dxa"/>
-            <w:tcBorders>
-              <w:top w:val="single" w:sz="4" w:space="0" w:color="auto"/>
-              <w:left w:val="nil"/>
-              <w:bottom w:val="single" w:sz="4" w:space="0" w:color="auto"/>
-              <w:right w:val="single" w:sz="4" w:space="0" w:color="auto"/>
-            </w:tcBorders>
-            <w:vAlign w:val="center"/>
-          </w:tcPr>
-          <w:p>
-            <w:pPr>
-              <w:jc w:val="center"/>
-              <w:rPr>
-                <w:rFonts w:cs="Arial"/>
-                <w:highlight w:val="yellow"/>
-                <w:lang w:val="en-US"/>
-              </w:rPr>
-            </w:pPr>
-            <w:r>
-              <w:rPr>
-                <w:rFonts w:cs="Arial"/>
-                <w:highlight w:val="yellow"/>
-                <w:lang w:val="en-US"/>
-              </w:rPr>
-              <w:t>657</w:t>
-            </w:r>
-          </w:p>
-        </w:tc>
-        <w:tc>
-          <w:tcPr>
-            <w:tcW w:w="1203" w:type="dxa"/>
-            <w:tcBorders>
-              <w:top w:val="single" w:sz="4" w:space="0" w:color="auto"/>
-              <w:left w:val="nil"/>
-              <w:bottom w:val="single" w:sz="4" w:space="0" w:color="auto"/>
-              <w:right w:val="single" w:sz="4" w:space="0" w:color="auto"/>
-            </w:tcBorders>
-            <w:vAlign w:val="center"/>
-          </w:tcPr>
-          <w:p>
-            <w:pPr>
-              <w:jc w:val="center"/>
-              <w:rPr>
-                <w:rFonts w:cs="Arial"/>
-                <w:highlight w:val="yellow"/>
-                <w:lang w:val="en-US"/>
-              </w:rPr>
-            </w:pPr>
-            <w:r>
-              <w:rPr>
-                <w:rFonts w:cs="Arial"/>
-                <w:highlight w:val="yellow"/>
-                <w:lang w:val="en-US"/>
-              </w:rPr>
-              <w:t>657</w:t>
-            </w:r>
-          </w:p>
-        </w:tc>
-        <w:tc>
-          <w:tcPr>
-            <w:tcW w:w="955" w:type="dxa"/>
-            <w:tcBorders>
-              <w:top w:val="single" w:sz="4" w:space="0" w:color="auto"/>
-              <w:left w:val="nil"/>
-              <w:bottom w:val="single" w:sz="4" w:space="0" w:color="auto"/>
-              <w:right w:val="single" w:sz="4" w:space="0" w:color="auto"/>
-            </w:tcBorders>
-            <w:vAlign w:val="center"/>
-          </w:tcPr>
-          <w:p>
-            <w:pPr>
-              <w:jc w:val="center"/>
-              <w:rPr>
-                <w:rFonts w:cs="Arial"/>
-                <w:highlight w:val="yellow"/>
-                <w:lang w:val="en-US"/>
-              </w:rPr>
-            </w:pPr>
-            <w:r>
-              <w:rPr>
-                <w:rFonts w:cs="Arial"/>
-                <w:highlight w:val="yellow"/>
-                <w:lang w:val="en-US"/>
-              </w:rPr>
-              <w:t>0</w:t>
-            </w:r>
-          </w:p>
-        </w:tc>
-      </w:tr>
-      <w:tr>
-        <w:trPr>
-          <w:trHeight w:val="386"/>
-        </w:trPr>
-        <w:tc>
-          <w:tcPr>
-            <w:tcW w:w="587" w:type="dxa"/>
-            <w:tcBorders>
-              <w:top w:val="single" w:sz="4" w:space="0" w:color="auto"/>
-              <w:left w:val="single" w:sz="4" w:space="0" w:color="auto"/>
-              <w:bottom w:val="single" w:sz="4" w:space="0" w:color="auto"/>
-              <w:right w:val="single" w:sz="4" w:space="0" w:color="auto"/>
-            </w:tcBorders>
-            <w:vAlign w:val="center"/>
-          </w:tcPr>
-          <w:p>
-            <w:pPr>
-              <w:jc w:val="center"/>
-              <w:rPr>
-                <w:rFonts w:eastAsia="Times New Roman" w:cs="Arial"/>
-                <w:highlight w:val="yellow"/>
-                <w:lang w:val="en-ID" w:eastAsia="en-ID"/>
-              </w:rPr>
-            </w:pPr>
-            <w:r>
-              <w:rPr>
-                <w:rFonts w:eastAsia="Times New Roman" w:cs="Arial"/>
-                <w:highlight w:val="yellow"/>
-                <w:lang w:val="en-ID" w:eastAsia="en-ID"/>
-              </w:rPr>
-              <w:t>4</w:t>
-            </w:r>
-          </w:p>
-        </w:tc>
-        <w:tc>
-          <w:tcPr>
-            <w:tcW w:w="4600" w:type="dxa"/>
-            <w:tcBorders>
-              <w:top w:val="single" w:sz="4" w:space="0" w:color="auto"/>
-              <w:left w:val="nil"/>
-              <w:bottom w:val="single" w:sz="4" w:space="0" w:color="auto"/>
-              <w:right w:val="single" w:sz="4" w:space="0" w:color="auto"/>
-            </w:tcBorders>
-            <w:vAlign w:val="center"/>
-          </w:tcPr>
-          <w:p>
-            <w:pPr>
-              <w:rPr>
-                <w:rFonts w:cs="Arial"/>
-                <w:highlight w:val="yellow"/>
-              </w:rPr>
-            </w:pPr>
-            <w:r>
-              <w:rPr>
-                <w:rFonts w:cs="Arial"/>
-                <w:highlight w:val="yellow"/>
-              </w:rPr>
-              <w:t>Data Surat Izin Usaha</w:t>
-            </w:r>
-          </w:p>
-        </w:tc>
-        <w:tc>
-          <w:tcPr>
-            <w:tcW w:w="1111" w:type="dxa"/>
-            <w:tcBorders>
-              <w:top w:val="single" w:sz="4" w:space="0" w:color="auto"/>
-              <w:left w:val="nil"/>
-              <w:bottom w:val="single" w:sz="4" w:space="0" w:color="auto"/>
-              <w:right w:val="single" w:sz="4" w:space="0" w:color="auto"/>
-            </w:tcBorders>
-            <w:vAlign w:val="center"/>
-          </w:tcPr>
-          <w:p>
-            <w:pPr>
-              <w:jc w:val="center"/>
-              <w:rPr>
-                <w:rFonts w:cs="Arial"/>
-                <w:highlight w:val="yellow"/>
-                <w:lang w:val="en-US"/>
-              </w:rPr>
-            </w:pPr>
-            <w:r>
-              <w:rPr>
-                <w:rFonts w:cs="Arial"/>
-                <w:highlight w:val="yellow"/>
-                <w:lang w:val="en-US"/>
-              </w:rPr>
-              <w:t>2024</w:t>
-            </w:r>
-          </w:p>
-        </w:tc>
-        <w:tc>
-          <w:tcPr>
-            <w:tcW w:w="1177" w:type="dxa"/>
-            <w:tcBorders>
-              <w:top w:val="single" w:sz="4" w:space="0" w:color="auto"/>
-              <w:left w:val="nil"/>
-              <w:bottom w:val="single" w:sz="4" w:space="0" w:color="auto"/>
-              <w:right w:val="single" w:sz="4" w:space="0" w:color="auto"/>
-            </w:tcBorders>
-            <w:vAlign w:val="center"/>
-          </w:tcPr>
-          <w:p>
-            <w:pPr>
-              <w:jc w:val="center"/>
-              <w:rPr>
-                <w:rFonts w:cs="Arial"/>
-                <w:highlight w:val="yellow"/>
-                <w:lang w:val="en-US"/>
-              </w:rPr>
-            </w:pPr>
-            <w:r>
-              <w:rPr>
-                <w:rFonts w:cs="Arial"/>
-                <w:highlight w:val="yellow"/>
-                <w:lang w:val="en-US"/>
-              </w:rPr>
-              <w:t>1455</w:t>
-            </w:r>
-          </w:p>
-        </w:tc>
-        <w:tc>
-          <w:tcPr>
-            <w:tcW w:w="1203" w:type="dxa"/>
-            <w:tcBorders>
-              <w:top w:val="single" w:sz="4" w:space="0" w:color="auto"/>
-              <w:left w:val="nil"/>
-              <w:bottom w:val="single" w:sz="4" w:space="0" w:color="auto"/>
-              <w:right w:val="single" w:sz="4" w:space="0" w:color="auto"/>
-            </w:tcBorders>
-            <w:vAlign w:val="center"/>
-          </w:tcPr>
-          <w:p>
-            <w:pPr>
-              <w:jc w:val="center"/>
-              <w:rPr>
-                <w:rFonts w:cs="Arial"/>
-                <w:highlight w:val="yellow"/>
-                <w:lang w:val="en-US"/>
-              </w:rPr>
-            </w:pPr>
-            <w:r>
-              <w:rPr>
-                <w:rFonts w:cs="Arial"/>
-                <w:highlight w:val="yellow"/>
-                <w:lang w:val="en-US"/>
-              </w:rPr>
-              <w:t>1455</w:t>
-            </w:r>
-          </w:p>
-        </w:tc>
-        <w:tc>
-          <w:tcPr>
-            <w:tcW w:w="955" w:type="dxa"/>
-            <w:tcBorders>
-              <w:top w:val="single" w:sz="4" w:space="0" w:color="auto"/>
-              <w:left w:val="nil"/>
-              <w:bottom w:val="single" w:sz="4" w:space="0" w:color="auto"/>
-              <w:right w:val="single" w:sz="4" w:space="0" w:color="auto"/>
-            </w:tcBorders>
-            <w:vAlign w:val="center"/>
-          </w:tcPr>
-          <w:p>
-            <w:pPr>
-              <w:jc w:val="center"/>
-              <w:rPr>
-                <w:rFonts w:cs="Arial"/>
-                <w:highlight w:val="yellow"/>
-                <w:lang w:val="en-US"/>
-              </w:rPr>
-            </w:pPr>
-            <w:r>
-              <w:rPr>
-                <w:rFonts w:cs="Arial"/>
-                <w:highlight w:val="yellow"/>
-                <w:lang w:val="en-US"/>
-              </w:rPr>
-              <w:t>0</w:t>
+              </w:rPr>
+              <w:t>}}</w:t>
             </w:r>
           </w:p>
         </w:tc>
@@ -3206,7 +3455,7 @@
               </w:rPr>
             </w:pPr>
             <w:r>
-              <w:t>Max Darmawan</w:t>
+              <w:t>Eddy Wahyudi</w:t>
             </w:r>
           </w:p>
           <w:p>
@@ -3271,8 +3520,8 @@
       </w:pPr>
     </w:p>
     <w:sectPr>
-      <w:headerReference w:type="default" r:id="rId17"/>
-      <w:headerReference w:type="first" r:id="rId18"/>
+      <w:headerReference w:type="default" r:id="rId13"/>
+      <w:headerReference w:type="first" r:id="rId14"/>
       <w:pgSz w:w="11906" w:h="16838"/>
       <w:pgMar w:top="1134" w:right="1134" w:bottom="1134" w:left="1418" w:header="720" w:footer="720" w:gutter="0"/>
       <w:cols w:space="0"/>
@@ -4637,15 +4886,6 @@
 </file>
 
 <file path=customXml/item1.xml><?xml version="1.0" encoding="utf-8"?>
-<?mso-contentType ?>
-<FormTemplates xmlns="http://schemas.microsoft.com/sharepoint/v3/contenttype/forms">
-  <Display>DocumentLibraryForm</Display>
-  <Edit>DocumentLibraryForm</Edit>
-  <New>DocumentLibraryForm</New>
-</FormTemplates>
-</file>
-
-<file path=customXml/item2.xml><?xml version="1.0" encoding="utf-8"?>
 <p:properties xmlns:p="http://schemas.microsoft.com/office/2006/metadata/properties" xmlns:xsi="http://www.w3.org/2001/XMLSchema-instance" xmlns:pc="http://schemas.microsoft.com/office/infopath/2007/PartnerControls">
   <documentManagement>
     <TaxCatchAll xmlns="6a3343e3-a342-4977-82e8-547b9d40dd28" xsi:nil="true"/>
@@ -4654,6 +4894,15 @@
     </lcf76f155ced4ddcb4097134ff3c332f>
   </documentManagement>
 </p:properties>
+</file>
+
+<file path=customXml/item2.xml><?xml version="1.0" encoding="utf-8"?>
+<?mso-contentType ?>
+<FormTemplates xmlns="http://schemas.microsoft.com/sharepoint/v3/contenttype/forms">
+  <Display>DocumentLibraryForm</Display>
+  <Edit>DocumentLibraryForm</Edit>
+  <New>DocumentLibraryForm</New>
+</FormTemplates>
 </file>
 
 <file path=customXml/item3.xml><?xml version="1.0" encoding="utf-8"?>
@@ -4852,6 +5101,17 @@
 </file>
 
 <file path=customXml/itemProps1.xml><?xml version="1.0" encoding="utf-8"?>
+<ds:datastoreItem xmlns:ds="http://schemas.openxmlformats.org/officeDocument/2006/customXml" ds:itemID="{68F97C91-8AAA-4241-BFB3-79DE058C21C2}">
+  <ds:schemaRefs>
+    <ds:schemaRef ds:uri="http://schemas.microsoft.com/office/2006/metadata/properties"/>
+    <ds:schemaRef ds:uri="http://schemas.microsoft.com/office/infopath/2007/PartnerControls"/>
+    <ds:schemaRef ds:uri="6a3343e3-a342-4977-82e8-547b9d40dd28"/>
+    <ds:schemaRef ds:uri="122b6bc9-85c8-4cf1-91e6-8e70987f848c"/>
+  </ds:schemaRefs>
+</ds:datastoreItem>
+</file>
+
+<file path=customXml/itemProps2.xml><?xml version="1.0" encoding="utf-8"?>
 <ds:datastoreItem xmlns:ds="http://schemas.openxmlformats.org/officeDocument/2006/customXml" ds:itemID="{016BB153-861F-4192-A688-0C944E34872E}">
   <ds:schemaRefs>
     <ds:schemaRef ds:uri="http://schemas.microsoft.com/sharepoint/v3/contenttype/forms"/>
@@ -4859,23 +5119,21 @@
 </ds:datastoreItem>
 </file>
 
-<file path=customXml/itemProps2.xml><?xml version="1.0" encoding="utf-8"?>
-<ds:datastoreItem xmlns:ds="http://schemas.openxmlformats.org/officeDocument/2006/customXml" ds:itemID="{68F97C91-8AAA-4241-BFB3-79DE058C21C2}">
+<file path=customXml/itemProps3.xml><?xml version="1.0" encoding="utf-8"?>
+<ds:datastoreItem xmlns:ds="http://schemas.openxmlformats.org/officeDocument/2006/customXml" ds:itemID="{5E004AFC-B270-4C09-8EB1-EEF529E594BB}">
   <ds:schemaRefs>
+    <ds:schemaRef ds:uri="http://schemas.microsoft.com/office/2006/metadata/contentType"/>
+    <ds:schemaRef ds:uri="http://schemas.microsoft.com/office/2006/metadata/properties/metaAttributes"/>
+    <ds:schemaRef ds:uri="http://www.w3.org/2001/XMLSchema"/>
+    <ds:schemaRef ds:uri="http://schemas.microsoft.com/office/2006/metadata/properties"/>
+    <ds:schemaRef ds:uri="122b6bc9-85c8-4cf1-91e6-8e70987f848c"/>
+    <ds:schemaRef ds:uri="6a3343e3-a342-4977-82e8-547b9d40dd28"/>
     <ds:schemaRef ds:uri="http://schemas.microsoft.com/office/2006/documentManagement/types"/>
-    <ds:schemaRef ds:uri="http://purl.org/dc/elements/1.1/"/>
-    <ds:schemaRef ds:uri="http://purl.org/dc/dcmitype/"/>
-    <ds:schemaRef ds:uri="0ef7128f-a7d0-43d2-bee4-5f56f49c64da"/>
-    <ds:schemaRef ds:uri="http://purl.org/dc/terms/"/>
-    <ds:schemaRef ds:uri="http://www.w3.org/XML/1998/namespace"/>
-    <ds:schemaRef ds:uri="http://schemas.microsoft.com/office/2006/metadata/properties"/>
-    <ds:schemaRef ds:uri="6d95bc28-2e5c-4ccd-92aa-ea746d833732"/>
     <ds:schemaRef ds:uri="http://schemas.microsoft.com/office/infopath/2007/PartnerControls"/>
     <ds:schemaRef ds:uri="http://schemas.openxmlformats.org/package/2006/metadata/core-properties"/>
+    <ds:schemaRef ds:uri="http://purl.org/dc/elements/1.1/"/>
+    <ds:schemaRef ds:uri="http://purl.org/dc/terms/"/>
+    <ds:schemaRef ds:uri="http://schemas.microsoft.com/internal/obd"/>
   </ds:schemaRefs>
 </ds:datastoreItem>
-</file>
-
-<file path=customXml/itemProps3.xml><?xml version="1.0" encoding="utf-8"?>
-<ds:datastoreItem xmlns:ds="http://schemas.openxmlformats.org/officeDocument/2006/customXml" ds:itemID="{5E004AFC-B270-4C09-8EB1-EEF529E594BB}"/>
 </file>
</xml_diff>